<commit_message>
fix: correct closed-source claims after source audit
The @paperclipai/server source is public (MIT license) at
github.com/paperclipai/paperclip. Updated all docs, report
generators, and regenerated DOCX files to reflect actual findings
from the source code audit (SSRF protection, path traversal
prevention, standard CJS-to-ESM bridge, local_disk default).

Co-Authored-By: Claude Opus 4.6 <noreply@anthropic.com>
</commit_message>
<xml_diff>
--- a/security/Security-Analysis-paperclipai-companies-sh.docx
+++ b/security/Security-Analysis-paperclipai-companies-sh.docx
@@ -89,7 +89,7 @@
           <w:sz w:val="22"/>
           <w:szCs w:val="22"/>
         </w:rPr>
-        <w:t xml:space="preserve">npm package: @paperclipai/server (11MB, closed source)</w:t>
+        <w:t xml:space="preserve">npm package: @paperclipai/server (11MB, open source — MIT)</w:t>
       </w:r>
     </w:p>
     <w:p>
@@ -189,7 +189,7 @@
                 <w:sz w:val="20"/>
                 <w:szCs w:val="20"/>
               </w:rPr>
-              <w:t xml:space="preserve">This package installs a persistent background server, a local database, and has unauditable closed-source components. Static analysis found no direct credential theft, but dynamic import capabilities and S3 upload infrastructure mean runtime behavior cannot be fully predicted from code alone. Docker isolation and network monitoring are required before any execution.</w:t>
+              <w:t xml:space="preserve">This package installs a persistent background server and a local database. The source code is fully public (MIT license). A source audit confirmed that S3 is an optional storage backend (local disk is default), dynamic imports are standard module loading, and plugin HTTP has SSRF protection. The persistent background server and young organization remain the primary concerns. Docker isolation is still recommended for initial evaluation.</w:t>
             </w:r>
           </w:p>
         </w:tc>
@@ -336,16 +336,16 @@
           <w:sz w:val="21"/>
           <w:szCs w:val="21"/>
         </w:rPr>
-        <w:t xml:space="preserve">Closed-source core</w:t>
-      </w:r>
-      <w:r>
-        <w:rPr>
-          <w:rFonts w:ascii="Arial" w:cs="Arial" w:eastAsia="Arial" w:hAnsi="Arial"/>
-          <w:color w:val="333333"/>
-          <w:sz w:val="21"/>
-          <w:szCs w:val="21"/>
-        </w:rPr>
-        <w:t xml:space="preserve"> — @paperclipai/server (11MB, 744 files) has no public source code; runtime behavior is unauditable</w:t>
+        <w:t xml:space="preserve">Open-source server</w:t>
+      </w:r>
+      <w:r>
+        <w:rPr>
+          <w:rFonts w:ascii="Arial" w:cs="Arial" w:eastAsia="Arial" w:hAnsi="Arial"/>
+          <w:color w:val="333333"/>
+          <w:sz w:val="21"/>
+          <w:szCs w:val="21"/>
+        </w:rPr>
+        <w:t xml:space="preserve"> — @paperclipai/server source is public (MIT) at github.com/paperclipai/paperclip. Source audit verified S3 is optional, fetch has SSRF protection, and dynamic imports are standard module loading.</w:t>
       </w:r>
     </w:p>
     <w:p>
@@ -1150,7 +1150,7 @@
                 <w:sz w:val="19"/>
                 <w:szCs w:val="19"/>
               </w:rPr>
-              <w:t xml:space="preserve">Unauditable server core</w:t>
+              <w:t xml:space="preserve">Young organization</w:t>
             </w:r>
           </w:p>
         </w:tc>
@@ -1180,11 +1180,11 @@
                 <w:rFonts w:ascii="Arial" w:cs="Arial" w:eastAsia="Arial" w:hAnsi="Arial"/>
                 <w:b/>
                 <w:bCs/>
-                <w:color w:val="C0392B"/>
-                <w:sz w:val="19"/>
-                <w:szCs w:val="19"/>
-              </w:rPr>
-              <w:t xml:space="preserve">HIGH</w:t>
+                <w:color w:val="E67E22"/>
+                <w:sz w:val="19"/>
+                <w:szCs w:val="19"/>
+              </w:rPr>
+              <w:t xml:space="preserve">MEDIUM</w:t>
             </w:r>
           </w:p>
         </w:tc>
@@ -1213,7 +1213,7 @@
                 <w:sz w:val="19"/>
                 <w:szCs w:val="19"/>
               </w:rPr>
-              <w:t xml:space="preserve">@paperclipai/server (11MB compiled JS) has no public source. You cannot verify what it does at runtime.</w:t>
+              <w:t xml:space="preserve">Entire org created 2026-02-27. 38k stars in 27 days, single maintainer. Source is public and auditable, but project maturity is low.</w:t>
             </w:r>
           </w:p>
         </w:tc>
@@ -1342,7 +1342,7 @@
                 <w:sz w:val="19"/>
                 <w:szCs w:val="19"/>
               </w:rPr>
-              <w:t xml:space="preserve">Dynamic code loading</w:t>
+              <w:t xml:space="preserve">Dynamic imports (CORRECTED)</w:t>
             </w:r>
           </w:p>
         </w:tc>
@@ -1372,11 +1372,11 @@
                 <w:rFonts w:ascii="Arial" w:cs="Arial" w:eastAsia="Arial" w:hAnsi="Arial"/>
                 <w:b/>
                 <w:bCs/>
-                <w:color w:val="C0392B"/>
-                <w:sz w:val="19"/>
-                <w:szCs w:val="19"/>
-              </w:rPr>
-              <w:t xml:space="preserve">HIGH</w:t>
+                <w:color w:val="27AE60"/>
+                <w:sz w:val="19"/>
+                <w:szCs w:val="19"/>
+              </w:rPr>
+              <w:t xml:space="preserve">LOW</w:t>
             </w:r>
           </w:p>
         </w:tc>
@@ -1405,7 +1405,7 @@
                 <w:sz w:val="19"/>
                 <w:szCs w:val="19"/>
               </w:rPr>
-              <w:t xml:space="preserve">new Function("specifier", "return import(specifier)") in paperclipai enables loading arbitrary modules at runtime, defeating static analysis.</w:t>
+              <w:t xml:space="preserve">The new Function() in compiled npm package is a CJS-to-ESM bridge. Source shows standard await import() for plugin manifests and embedded-postgres. Not arbitrary code execution.</w:t>
             </w:r>
           </w:p>
         </w:tc>
@@ -1438,7 +1438,7 @@
                 <w:sz w:val="19"/>
                 <w:szCs w:val="19"/>
               </w:rPr>
-              <w:t xml:space="preserve">S3 upload capability</w:t>
+              <w:t xml:space="preserve">S3 storage (CORRECTED)</w:t>
             </w:r>
           </w:p>
         </w:tc>
@@ -1468,11 +1468,11 @@
                 <w:rFonts w:ascii="Arial" w:cs="Arial" w:eastAsia="Arial" w:hAnsi="Arial"/>
                 <w:b/>
                 <w:bCs/>
-                <w:color w:val="C0392B"/>
-                <w:sz w:val="19"/>
-                <w:szCs w:val="19"/>
-              </w:rPr>
-              <w:t xml:space="preserve">HIGH</w:t>
+                <w:color w:val="27AE60"/>
+                <w:sz w:val="19"/>
+                <w:szCs w:val="19"/>
+              </w:rPr>
+              <w:t xml:space="preserve">LOW</w:t>
             </w:r>
           </w:p>
         </w:tc>
@@ -1501,7 +1501,7 @@
                 <w:sz w:val="19"/>
                 <w:szCs w:val="19"/>
               </w:rPr>
-              <w:t xml:space="preserve">Full S3 configuration with default bucket named "paperclip". Infrastructure for data exfiltration exists even if not currently active.</w:t>
+              <w:t xml:space="preserve">S3 is an optional storage backend; default is local_disk. Only activated when explicitly configured by the user. Not an exfiltration vector in default configuration.</w:t>
             </w:r>
           </w:p>
         </w:tc>
@@ -1597,7 +1597,7 @@
                 <w:sz w:val="19"/>
                 <w:szCs w:val="19"/>
               </w:rPr>
-              <w:t xml:space="preserve">Entire org created 2026-02-27. Main repo: 38k stars in 27 days, single maintainer (cryppadotta, protonmail). Star inflation at this velocity is a known social engineering pattern.</w:t>
+              <w:t xml:space="preserve">Entire org created 2026-02-27. Main repo: 38k stars in 27 days, single maintainer (cryppadotta, protonmail). Source is public but project maturity is low.</w:t>
             </w:r>
           </w:p>
         </w:tc>
@@ -1789,7 +1789,7 @@
                 <w:sz w:val="19"/>
                 <w:szCs w:val="19"/>
               </w:rPr>
-              <w:t xml:space="preserve">Agents get $AGENT_HOME with read/write. chokidar watches broadly. Scope depends on unauditable server sandbox.</w:t>
+              <w:t xml:space="preserve">Agents get $AGENT_HOME with read/write. Local disk storage has path traversal prevention (resolveWithin with .. rejection). chokidar watches broadly.</w:t>
             </w:r>
           </w:p>
         </w:tc>
@@ -1918,7 +1918,7 @@
                 <w:sz w:val="19"/>
                 <w:szCs w:val="19"/>
               </w:rPr>
-              <w:t xml:space="preserve">Generic fetch(url)</w:t>
+              <w:t xml:space="preserve">Plugin HTTP fetch (CORRECTED)</w:t>
             </w:r>
           </w:p>
         </w:tc>
@@ -1948,11 +1948,11 @@
                 <w:rFonts w:ascii="Arial" w:cs="Arial" w:eastAsia="Arial" w:hAnsi="Arial"/>
                 <w:b/>
                 <w:bCs/>
-                <w:color w:val="E67E22"/>
-                <w:sz w:val="19"/>
-                <w:szCs w:val="19"/>
-              </w:rPr>
-              <w:t xml:space="preserve">MEDIUM</w:t>
+                <w:color w:val="27AE60"/>
+                <w:sz w:val="19"/>
+                <w:szCs w:val="19"/>
+              </w:rPr>
+              <w:t xml:space="preserve">LOW</w:t>
             </w:r>
           </w:p>
         </w:tc>
@@ -1981,7 +1981,7 @@
                 <w:sz w:val="19"/>
                 <w:szCs w:val="19"/>
               </w:rPr>
-              <w:t xml:space="preserve">paperclipai contains fetch() calls with variable URLs — destinations determined at runtime, not just hardcoded API endpoints.</w:t>
+              <w:t xml:space="preserve">Plugin fetch has full SSRF protection: protocol whitelist (http/https only), DNS resolution with private IP blocking, and DNS-pinning to prevent rebinding attacks. Well-implemented.</w:t>
             </w:r>
           </w:p>
         </w:tc>
@@ -2809,7 +2809,7 @@
                 <w:sz w:val="19"/>
                 <w:szCs w:val="19"/>
               </w:rPr>
-              <w:t xml:space="preserve">CONCERN — new Function("specifier", "return import(specifier)") enables dynamic imports</w:t>
+              <w:t xml:space="preserve">EXPLAINED — CJS-to-ESM bridge in compiled output. Source uses standard await import() for plugin manifests.</w:t>
             </w:r>
           </w:p>
         </w:tc>
@@ -2873,7 +2873,7 @@
                 <w:sz w:val="19"/>
                 <w:szCs w:val="19"/>
               </w:rPr>
-              <w:t xml:space="preserve">MIXED — api.anthropic.com and api.openai.com (expected), plus generic fetch(url) with variable destinations</w:t>
+              <w:t xml:space="preserve">VERIFIED — api.anthropic.com/api.openai.com (credential checks), GitHub API (template downloads), plugin fetch with SSRF protection</w:t>
             </w:r>
           </w:p>
         </w:tc>
@@ -3129,7 +3129,7 @@
                 <w:sz w:val="19"/>
                 <w:szCs w:val="19"/>
               </w:rPr>
-              <w:t xml:space="preserve">CONFIRMED — full S3 config schema, bucket setup (default: "paperclip"), region config, @aws-sdk/client-s3</w:t>
+              <w:t xml:space="preserve">OPTIONAL — S3 is an alternative storage backend, default is local_disk. Only used when explicitly configured by the user.</w:t>
             </w:r>
           </w:p>
         </w:tc>
@@ -3218,7 +3218,7 @@
           <w:sz w:val="22"/>
           <w:szCs w:val="22"/>
         </w:rPr>
-        <w:t xml:space="preserve">What the Scan Cannot Tell You</w:t>
+        <w:t xml:space="preserve">Source Audit Clarifications</w:t>
       </w:r>
     </w:p>
     <w:p>
@@ -3232,7 +3232,7 @@
           <w:sz w:val="21"/>
           <w:szCs w:val="21"/>
         </w:rPr>
-        <w:t xml:space="preserve">The presence of new Function() for dynamic imports means the package can load and execute arbitrary code at runtime that is not visible in the static scan. The generic fetch(url) calls with variable URLs mean network destinations are determined at runtime. Full behavioral analysis requires monitored execution (see Section 5, Gates 1–2).</w:t>
+        <w:t xml:space="preserve">A source audit of the TypeScript code (github.com/paperclipai/paperclip/tree/master/server/src) resolved several concerns from the static scan of compiled artifacts. The new Function() pattern is a standard CJS-to-ESM bridge, not arbitrary code execution. The generic fetch() calls are for GitHub API access and plugin HTTP with SSRF protection (protocol whitelist, DNS pinning, private IP blocking). S3 is a user-configured optional storage backend. Docker isolation is still recommended for initial evaluation due to the persistent background server and the project's young age.</w:t>
       </w:r>
     </w:p>
     <w:p>
@@ -4742,7 +4742,7 @@
                 <w:sz w:val="20"/>
                 <w:szCs w:val="20"/>
               </w:rPr>
-              <w:t xml:space="preserve">Agent instruction clauses like "never exfiltrate secrets" are LLM prompts, not access controls. They can be overridden by prompt injection or ignored by the underlying tool framework. The actual security boundary is what the server code permits, and that code is closed-source.</w:t>
+              <w:t xml:space="preserve">Agent instruction clauses like "never exfiltrate secrets" are LLM prompts, not access controls. However, the server code (now auditable) implements real security boundaries: SSRF protection on plugin HTTP, path traversal prevention on local storage, and protocol whitelisting.</w:t>
             </w:r>
           </w:p>
         </w:tc>
@@ -4837,16 +4837,16 @@
           <w:sz w:val="21"/>
           <w:szCs w:val="21"/>
         </w:rPr>
-        <w:t xml:space="preserve">Cannot be fully cleared: </w:t>
-      </w:r>
-      <w:r>
-        <w:rPr>
-          <w:rFonts w:ascii="Arial" w:cs="Arial" w:eastAsia="Arial" w:hAnsi="Arial"/>
-          <w:color w:val="333333"/>
-          <w:sz w:val="21"/>
-          <w:szCs w:val="21"/>
-        </w:rPr>
-        <w:t xml:space="preserve">Dynamic code loading (new Function), generic fetch with variable URLs, and a closed-source 11MB server core mean runtime behavior is unpredictable from static analysis alone.</w:t>
+        <w:t xml:space="preserve">Source audit resolved key concerns: </w:t>
+      </w:r>
+      <w:r>
+        <w:rPr>
+          <w:rFonts w:ascii="Arial" w:cs="Arial" w:eastAsia="Arial" w:hAnsi="Arial"/>
+          <w:color w:val="333333"/>
+          <w:sz w:val="21"/>
+          <w:szCs w:val="21"/>
+        </w:rPr>
+        <w:t xml:space="preserve">S3 is optional (default: local disk), dynamic imports are standard module loading, and plugin HTTP has proper SSRF protection with DNS pinning.</w:t>
       </w:r>
     </w:p>
     <w:p>

</xml_diff>